<commit_message>
Added preliminary analysis report
</commit_message>
<xml_diff>
--- a/reports/Group/Chartering report.docx
+++ b/reports/Group/Chartering report.docx
@@ -179,6 +179,7 @@
           <w:lang w:val="en-US"/>
         </w:rPr>
       </w:pPr>
+      <w:proofErr w:type="spellStart"/>
       <w:r>
         <w:rPr>
           <w:rFonts w:ascii="Times New Roman" w:hAnsi="Times New Roman" w:cs="Times New Roman"/>
@@ -186,7 +187,17 @@
           <w:szCs w:val="24"/>
           <w:lang w:val="en-US"/>
         </w:rPr>
-        <w:t>Miembros:</w:t>
+        <w:t>Miembros</w:t>
+      </w:r>
+      <w:proofErr w:type="spellEnd"/>
+      <w:r>
+        <w:rPr>
+          <w:rFonts w:ascii="Times New Roman" w:hAnsi="Times New Roman" w:cs="Times New Roman"/>
+          <w:sz w:val="24"/>
+          <w:szCs w:val="24"/>
+          <w:lang w:val="en-US"/>
+        </w:rPr>
+        <w:t>:</w:t>
       </w:r>
     </w:p>
     <w:p>
@@ -1425,6 +1436,7 @@
       </w:pPr>
       <w:bookmarkStart w:id="0" w:name="_Toc221982962"/>
       <w:r>
+        <w:lastRenderedPageBreak/>
         <w:t>Resumen ejecutivo</w:t>
       </w:r>
       <w:bookmarkEnd w:id="0"/>
@@ -1461,7 +1473,25 @@
           <w:sz w:val="24"/>
           <w:szCs w:val="24"/>
         </w:rPr>
-        <w:t xml:space="preserve"> a través de los canales oficiales, así como el compromiso formal de todos los miembros con los objetivos académicos de la asignatura. Además, se definen los indicadores de rendimiento (KPIs) y las normas de régimen interno, incluyendo recompensas, sanciones y las condiciones bajo las cuales un miembro podría ser expulsado del equipo, garantizando así un marco de trabajo profesional y transparente.</w:t>
+        <w:t xml:space="preserve"> a través de los canales oficiales, así como el compromiso formal de todos los miembros con los objetivos académicos de la asignatura. Además, se definen los indicadores de rendimiento (</w:t>
+      </w:r>
+      <w:proofErr w:type="spellStart"/>
+      <w:r>
+        <w:rPr>
+          <w:rFonts w:cs="Times New Roman"/>
+          <w:sz w:val="24"/>
+          <w:szCs w:val="24"/>
+        </w:rPr>
+        <w:t>KPIs</w:t>
+      </w:r>
+      <w:proofErr w:type="spellEnd"/>
+      <w:r>
+        <w:rPr>
+          <w:rFonts w:cs="Times New Roman"/>
+          <w:sz w:val="24"/>
+          <w:szCs w:val="24"/>
+        </w:rPr>
+        <w:t>) y las normas de régimen interno, incluyendo recompensas, sanciones y las condiciones bajo las cuales un miembro podría ser expulsado del equipo, garantizando así un marco de trabajo profesional y transparente.</w:t>
       </w:r>
     </w:p>
     <w:p>
@@ -1580,6 +1610,9 @@
             <w:pPr>
               <w:jc w:val="center"/>
             </w:pPr>
+            <w:r>
+              <w:t>2.0</w:t>
+            </w:r>
           </w:p>
         </w:tc>
         <w:tc>
@@ -1590,13 +1623,26 @@
             <w:pPr>
               <w:jc w:val="center"/>
             </w:pPr>
+            <w:r>
+              <w:t>13/</w:t>
+            </w:r>
+            <w:r>
+              <w:t>04/2026</w:t>
+            </w:r>
           </w:p>
         </w:tc>
         <w:tc>
           <w:tcPr>
             <w:tcW w:w="4813" w:type="dxa"/>
           </w:tcPr>
-          <w:p/>
+          <w:p>
+            <w:r>
+              <w:t xml:space="preserve">Actualización documento para </w:t>
+            </w:r>
+            <w:r>
+              <w:t>nivel B</w:t>
+            </w:r>
+          </w:p>
         </w:tc>
       </w:tr>
     </w:tbl>
@@ -1808,6 +1854,7 @@
       </w:pPr>
       <w:bookmarkStart w:id="5" w:name="_Toc221982967"/>
       <w:r>
+        <w:lastRenderedPageBreak/>
         <w:t>Declaración de compromiso</w:t>
       </w:r>
       <w:bookmarkEnd w:id="5"/>
@@ -2042,6 +2089,7 @@
           <w:szCs w:val="24"/>
         </w:rPr>
       </w:pPr>
+      <w:proofErr w:type="spellStart"/>
       <w:r>
         <w:rPr>
           <w:b/>
@@ -2049,7 +2097,37 @@
           <w:sz w:val="24"/>
           <w:szCs w:val="24"/>
         </w:rPr>
-        <w:t>Performing well (Buen desempeño):</w:t>
+        <w:t>Performing</w:t>
+      </w:r>
+      <w:proofErr w:type="spellEnd"/>
+      <w:r>
+        <w:rPr>
+          <w:b/>
+          <w:bCs/>
+          <w:sz w:val="24"/>
+          <w:szCs w:val="24"/>
+        </w:rPr>
+        <w:t xml:space="preserve"> </w:t>
+      </w:r>
+      <w:proofErr w:type="spellStart"/>
+      <w:r>
+        <w:rPr>
+          <w:b/>
+          <w:bCs/>
+          <w:sz w:val="24"/>
+          <w:szCs w:val="24"/>
+        </w:rPr>
+        <w:t>well</w:t>
+      </w:r>
+      <w:proofErr w:type="spellEnd"/>
+      <w:r>
+        <w:rPr>
+          <w:b/>
+          <w:bCs/>
+          <w:sz w:val="24"/>
+          <w:szCs w:val="24"/>
+        </w:rPr>
+        <w:t xml:space="preserve"> (Buen desempeño):</w:t>
       </w:r>
       <w:r>
         <w:rPr>
@@ -2079,6 +2157,7 @@
           <w:szCs w:val="24"/>
         </w:rPr>
       </w:pPr>
+      <w:proofErr w:type="spellStart"/>
       <w:r>
         <w:rPr>
           <w:b/>
@@ -2086,7 +2165,37 @@
           <w:sz w:val="24"/>
           <w:szCs w:val="24"/>
         </w:rPr>
-        <w:t>Performing bad (Mal desempeño):</w:t>
+        <w:t>Performing</w:t>
+      </w:r>
+      <w:proofErr w:type="spellEnd"/>
+      <w:r>
+        <w:rPr>
+          <w:b/>
+          <w:bCs/>
+          <w:sz w:val="24"/>
+          <w:szCs w:val="24"/>
+        </w:rPr>
+        <w:t xml:space="preserve"> </w:t>
+      </w:r>
+      <w:proofErr w:type="spellStart"/>
+      <w:r>
+        <w:rPr>
+          <w:b/>
+          <w:bCs/>
+          <w:sz w:val="24"/>
+          <w:szCs w:val="24"/>
+        </w:rPr>
+        <w:t>bad</w:t>
+      </w:r>
+      <w:proofErr w:type="spellEnd"/>
+      <w:r>
+        <w:rPr>
+          <w:b/>
+          <w:bCs/>
+          <w:sz w:val="24"/>
+          <w:szCs w:val="24"/>
+        </w:rPr>
+        <w:t xml:space="preserve"> (Mal desempeño):</w:t>
       </w:r>
       <w:r>
         <w:rPr>
@@ -2269,7 +2378,23 @@
           <w:sz w:val="24"/>
           <w:szCs w:val="24"/>
         </w:rPr>
-        <w:t>Subir versiones obsoletas o incompatibles del framework al repositorio.</w:t>
+        <w:t xml:space="preserve">Subir versiones obsoletas o incompatibles del </w:t>
+      </w:r>
+      <w:proofErr w:type="spellStart"/>
+      <w:r>
+        <w:rPr>
+          <w:sz w:val="24"/>
+          <w:szCs w:val="24"/>
+        </w:rPr>
+        <w:t>framework</w:t>
+      </w:r>
+      <w:proofErr w:type="spellEnd"/>
+      <w:r>
+        <w:rPr>
+          <w:sz w:val="24"/>
+          <w:szCs w:val="24"/>
+        </w:rPr>
+        <w:t xml:space="preserve"> al repositorio.</w:t>
       </w:r>
     </w:p>
     <w:p>
@@ -2336,7 +2461,15 @@
           <w:sz w:val="24"/>
           <w:szCs w:val="24"/>
         </w:rPr>
-        <w:t xml:space="preserve"> Ante cualquiera de estos incidentes, la persona responsable debe asumir la autoría y solventar el problema en un tiempo prudencial. Si el responsable no se responsabiliza de la acción o no aplica la solución en el plazo estipulado, se procederá a su despido. </w:t>
+        <w:t xml:space="preserve"> Ante cualquiera de estos incidentes, la persona responsable debe asumir la autoría y solventar el problema en un tiempo </w:t>
+      </w:r>
+      <w:r>
+        <w:rPr>
+          <w:sz w:val="24"/>
+          <w:szCs w:val="24"/>
+        </w:rPr>
+        <w:lastRenderedPageBreak/>
+        <w:t xml:space="preserve">prudencial. Si el responsable no se responsabiliza de la acción o no aplica la solución en el plazo estipulado, se procederá a su despido. </w:t>
       </w:r>
     </w:p>
     <w:p>
@@ -2395,12 +2528,21 @@
           <w:rFonts w:asciiTheme="minorHAnsi" w:hAnsiTheme="minorHAnsi"/>
         </w:rPr>
       </w:pPr>
+      <w:proofErr w:type="spellStart"/>
       <w:r>
         <w:rPr>
           <w:rFonts w:asciiTheme="minorHAnsi" w:hAnsiTheme="minorHAnsi"/>
           <w:lang w:val="en-US"/>
         </w:rPr>
-        <w:t xml:space="preserve">Corchuelo, R. (2025). </w:t>
+        <w:t>Corchuelo</w:t>
+      </w:r>
+      <w:proofErr w:type="spellEnd"/>
+      <w:r>
+        <w:rPr>
+          <w:rFonts w:asciiTheme="minorHAnsi" w:hAnsiTheme="minorHAnsi"/>
+          <w:lang w:val="en-US"/>
+        </w:rPr>
+        <w:t xml:space="preserve">, R. (2025). </w:t>
       </w:r>
       <w:r>
         <w:rPr>
@@ -2438,12 +2580,21 @@
           <w:rFonts w:asciiTheme="minorHAnsi" w:hAnsiTheme="minorHAnsi"/>
         </w:rPr>
       </w:pPr>
+      <w:proofErr w:type="spellStart"/>
       <w:r>
         <w:rPr>
           <w:rFonts w:asciiTheme="minorHAnsi" w:hAnsiTheme="minorHAnsi"/>
           <w:lang w:val="en-US"/>
         </w:rPr>
-        <w:t xml:space="preserve">Corchuelo, R. (2025). </w:t>
+        <w:t>Corchuelo</w:t>
+      </w:r>
+      <w:proofErr w:type="spellEnd"/>
+      <w:r>
+        <w:rPr>
+          <w:rFonts w:asciiTheme="minorHAnsi" w:hAnsiTheme="minorHAnsi"/>
+          <w:lang w:val="en-US"/>
+        </w:rPr>
+        <w:t xml:space="preserve">, R. (2025). </w:t>
       </w:r>
       <w:r>
         <w:rPr>

</xml_diff>